<commit_message>
Update localization language settings plan
</commit_message>
<xml_diff>
--- a/Docs/DIR_DIVING_English_Translation_Reference.docx
+++ b/Docs/DIR_DIVING_English_Translation_Reference.docx
@@ -6092,6 +6092,1306 @@
         <w:t>No stable branch string references an experimental feature unless the stable UI intentionally contains a placeholder.</w:t>
       </w:r>
     </w:p>
+    <w:p>
+      <w:pPr>
+        <w:pStyle w:val="Heading1"/>
+      </w:pPr>
+      <w:r>
+        <w:rPr>
+          <w:rFonts w:ascii="Calibri" w:hAnsi="Calibri" w:eastAsia="Calibri"/>
+          <w:b/>
+          <w:color w:val="007AFF"/>
+          <w:sz w:val="32"/>
+        </w:rPr>
+        <w:t>12. Device Language and Settings Copy</w:t>
+      </w:r>
+    </w:p>
+    <w:p>
+      <w:r>
+        <w:rPr>
+          <w:rFonts w:ascii="Calibri" w:hAnsi="Calibri" w:eastAsia="Calibri"/>
+        </w:rPr>
+        <w:t>Use these English strings when implementing automatic device-language behavior and the manual language selector in Settings.</w:t>
+      </w:r>
+    </w:p>
+    <w:p>
+      <w:pPr>
+        <w:spacing w:after="80"/>
+      </w:pPr>
+      <w:r>
+        <w:rPr>
+          <w:rFonts w:ascii="Calibri" w:hAnsi="Calibri" w:eastAsia="Calibri"/>
+          <w:b/>
+          <w:color w:val="0B1F30"/>
+          <w:sz w:val="20"/>
+        </w:rPr>
+        <w:t>Settings and automatic language behavior copy</w:t>
+      </w:r>
+    </w:p>
+    <w:tbl>
+      <w:tblPr>
+        <w:tblStyle w:val="TableGrid"/>
+        <w:tblW w:type="dxa" w:w="9360"/>
+        <w:tblLayout w:type="fixed"/>
+        <w:tblLook w:firstColumn="1" w:firstRow="1" w:lastColumn="0" w:lastRow="0" w:noHBand="0" w:noVBand="1" w:val="04A0"/>
+      </w:tblPr>
+      <w:tblGrid>
+        <w:gridCol w:w="3120"/>
+        <w:gridCol w:w="3120"/>
+        <w:gridCol w:w="3120"/>
+      </w:tblGrid>
+      <w:tr>
+        <w:trPr>
+          <w:tblHeader w:val="true"/>
+        </w:trPr>
+        <w:tc>
+          <w:tcPr>
+            <w:tcW w:type="dxa" w:w="3096"/>
+            <w:shd w:fill="D9EEF7"/>
+            <w:tcMar>
+              <w:top w:w="80" w:type="dxa"/>
+              <w:start w:w="120" w:type="dxa"/>
+              <w:bottom w:w="80" w:type="dxa"/>
+              <w:end w:w="120" w:type="dxa"/>
+            </w:tcMar>
+            <w:vAlign w:val="center"/>
+          </w:tcPr>
+          <w:p>
+            <w:pPr>
+              <w:spacing w:after="0"/>
+            </w:pPr>
+            <w:r>
+              <w:rPr>
+                <w:rFonts w:ascii="Calibri" w:hAnsi="Calibri" w:eastAsia="Calibri"/>
+                <w:b/>
+                <w:color w:val="0B1F30"/>
+                <w:sz w:val="20"/>
+              </w:rPr>
+              <w:t>Italian source</w:t>
+            </w:r>
+          </w:p>
+        </w:tc>
+        <w:tc>
+          <w:tcPr>
+            <w:tcW w:type="dxa" w:w="3168"/>
+            <w:shd w:fill="D9EEF7"/>
+            <w:tcMar>
+              <w:top w:w="80" w:type="dxa"/>
+              <w:start w:w="120" w:type="dxa"/>
+              <w:bottom w:w="80" w:type="dxa"/>
+              <w:end w:w="120" w:type="dxa"/>
+            </w:tcMar>
+            <w:vAlign w:val="center"/>
+          </w:tcPr>
+          <w:p>
+            <w:pPr>
+              <w:spacing w:after="0"/>
+            </w:pPr>
+            <w:r>
+              <w:rPr>
+                <w:rFonts w:ascii="Calibri" w:hAnsi="Calibri" w:eastAsia="Calibri"/>
+                <w:b/>
+                <w:color w:val="0B1F30"/>
+                <w:sz w:val="20"/>
+              </w:rPr>
+              <w:t>English reference</w:t>
+            </w:r>
+          </w:p>
+        </w:tc>
+        <w:tc>
+          <w:tcPr>
+            <w:tcW w:type="dxa" w:w="3096"/>
+            <w:shd w:fill="D9EEF7"/>
+            <w:tcMar>
+              <w:top w:w="80" w:type="dxa"/>
+              <w:start w:w="120" w:type="dxa"/>
+              <w:bottom w:w="80" w:type="dxa"/>
+              <w:end w:w="120" w:type="dxa"/>
+            </w:tcMar>
+            <w:vAlign w:val="center"/>
+          </w:tcPr>
+          <w:p>
+            <w:pPr>
+              <w:spacing w:after="0"/>
+            </w:pPr>
+            <w:r>
+              <w:rPr>
+                <w:rFonts w:ascii="Calibri" w:hAnsi="Calibri" w:eastAsia="Calibri"/>
+                <w:b/>
+                <w:color w:val="0B1F30"/>
+                <w:sz w:val="20"/>
+              </w:rPr>
+              <w:t>Context / note</w:t>
+            </w:r>
+          </w:p>
+        </w:tc>
+      </w:tr>
+      <w:tr>
+        <w:tc>
+          <w:tcPr>
+            <w:tcW w:type="dxa" w:w="3120"/>
+            <w:tcMar>
+              <w:top w:w="80" w:type="dxa"/>
+              <w:start w:w="120" w:type="dxa"/>
+              <w:bottom w:w="80" w:type="dxa"/>
+              <w:end w:w="120" w:type="dxa"/>
+            </w:tcMar>
+            <w:vAlign w:val="center"/>
+          </w:tcPr>
+          <w:p>
+            <w:pPr>
+              <w:spacing w:after="0" w:line="264" w:lineRule="auto"/>
+            </w:pPr>
+            <w:r>
+              <w:rPr>
+                <w:rFonts w:ascii="Calibri" w:hAnsi="Calibri" w:eastAsia="Calibri"/>
+                <w:sz w:val="20"/>
+              </w:rPr>
+              <w:t>Lingua di sistema</w:t>
+            </w:r>
+          </w:p>
+        </w:tc>
+        <w:tc>
+          <w:tcPr>
+            <w:tcW w:type="dxa" w:w="3120"/>
+            <w:tcMar>
+              <w:top w:w="80" w:type="dxa"/>
+              <w:start w:w="120" w:type="dxa"/>
+              <w:bottom w:w="80" w:type="dxa"/>
+              <w:end w:w="120" w:type="dxa"/>
+            </w:tcMar>
+            <w:vAlign w:val="center"/>
+          </w:tcPr>
+          <w:p>
+            <w:pPr>
+              <w:spacing w:after="0" w:line="264" w:lineRule="auto"/>
+            </w:pPr>
+            <w:r>
+              <w:rPr>
+                <w:rFonts w:ascii="Calibri" w:hAnsi="Calibri" w:eastAsia="Calibri"/>
+                <w:sz w:val="20"/>
+              </w:rPr>
+              <w:t>System Language</w:t>
+            </w:r>
+          </w:p>
+        </w:tc>
+        <w:tc>
+          <w:tcPr>
+            <w:tcW w:type="dxa" w:w="3120"/>
+            <w:tcMar>
+              <w:top w:w="80" w:type="dxa"/>
+              <w:start w:w="120" w:type="dxa"/>
+              <w:bottom w:w="80" w:type="dxa"/>
+              <w:end w:w="120" w:type="dxa"/>
+            </w:tcMar>
+            <w:vAlign w:val="center"/>
+          </w:tcPr>
+          <w:p>
+            <w:pPr>
+              <w:spacing w:after="0" w:line="264" w:lineRule="auto"/>
+            </w:pPr>
+            <w:r>
+              <w:rPr>
+                <w:rFonts w:ascii="Calibri" w:hAnsi="Calibri" w:eastAsia="Calibri"/>
+                <w:sz w:val="20"/>
+              </w:rPr>
+              <w:t>Default option. Follows Apple Watch language on Watch and iPhone/iOS language on Companion.</w:t>
+            </w:r>
+          </w:p>
+        </w:tc>
+      </w:tr>
+      <w:tr>
+        <w:tc>
+          <w:tcPr>
+            <w:tcW w:type="dxa" w:w="3120"/>
+            <w:tcMar>
+              <w:top w:w="80" w:type="dxa"/>
+              <w:start w:w="120" w:type="dxa"/>
+              <w:bottom w:w="80" w:type="dxa"/>
+              <w:end w:w="120" w:type="dxa"/>
+            </w:tcMar>
+            <w:vAlign w:val="center"/>
+          </w:tcPr>
+          <w:p>
+            <w:pPr>
+              <w:spacing w:after="0" w:line="264" w:lineRule="auto"/>
+            </w:pPr>
+            <w:r>
+              <w:rPr>
+                <w:rFonts w:ascii="Calibri" w:hAnsi="Calibri" w:eastAsia="Calibri"/>
+                <w:sz w:val="20"/>
+              </w:rPr>
+              <w:t>Usa lingua dispositivo</w:t>
+            </w:r>
+          </w:p>
+        </w:tc>
+        <w:tc>
+          <w:tcPr>
+            <w:tcW w:type="dxa" w:w="3120"/>
+            <w:tcMar>
+              <w:top w:w="80" w:type="dxa"/>
+              <w:start w:w="120" w:type="dxa"/>
+              <w:bottom w:w="80" w:type="dxa"/>
+              <w:end w:w="120" w:type="dxa"/>
+            </w:tcMar>
+            <w:vAlign w:val="center"/>
+          </w:tcPr>
+          <w:p>
+            <w:pPr>
+              <w:spacing w:after="0" w:line="264" w:lineRule="auto"/>
+            </w:pPr>
+            <w:r>
+              <w:rPr>
+                <w:rFonts w:ascii="Calibri" w:hAnsi="Calibri" w:eastAsia="Calibri"/>
+                <w:sz w:val="20"/>
+              </w:rPr>
+              <w:t>Use Device Language</w:t>
+            </w:r>
+          </w:p>
+        </w:tc>
+        <w:tc>
+          <w:tcPr>
+            <w:tcW w:type="dxa" w:w="3120"/>
+            <w:tcMar>
+              <w:top w:w="80" w:type="dxa"/>
+              <w:start w:w="120" w:type="dxa"/>
+              <w:bottom w:w="80" w:type="dxa"/>
+              <w:end w:w="120" w:type="dxa"/>
+            </w:tcMar>
+            <w:vAlign w:val="center"/>
+          </w:tcPr>
+          <w:p>
+            <w:pPr>
+              <w:spacing w:after="0" w:line="264" w:lineRule="auto"/>
+            </w:pPr>
+            <w:r>
+              <w:rPr>
+                <w:rFonts w:ascii="Calibri" w:hAnsi="Calibri" w:eastAsia="Calibri"/>
+                <w:sz w:val="20"/>
+              </w:rPr>
+              <w:t>Optional explanatory label if the UI needs a shorter sentence.</w:t>
+            </w:r>
+          </w:p>
+        </w:tc>
+      </w:tr>
+      <w:tr>
+        <w:tc>
+          <w:tcPr>
+            <w:tcW w:type="dxa" w:w="3120"/>
+            <w:tcMar>
+              <w:top w:w="80" w:type="dxa"/>
+              <w:start w:w="120" w:type="dxa"/>
+              <w:bottom w:w="80" w:type="dxa"/>
+              <w:end w:w="120" w:type="dxa"/>
+            </w:tcMar>
+            <w:vAlign w:val="center"/>
+          </w:tcPr>
+          <w:p>
+            <w:pPr>
+              <w:spacing w:after="0" w:line="264" w:lineRule="auto"/>
+            </w:pPr>
+            <w:r>
+              <w:rPr>
+                <w:rFonts w:ascii="Calibri" w:hAnsi="Calibri" w:eastAsia="Calibri"/>
+                <w:sz w:val="20"/>
+              </w:rPr>
+              <w:t>Segue la lingua di Apple Watch</w:t>
+            </w:r>
+          </w:p>
+        </w:tc>
+        <w:tc>
+          <w:tcPr>
+            <w:tcW w:type="dxa" w:w="3120"/>
+            <w:tcMar>
+              <w:top w:w="80" w:type="dxa"/>
+              <w:start w:w="120" w:type="dxa"/>
+              <w:bottom w:w="80" w:type="dxa"/>
+              <w:end w:w="120" w:type="dxa"/>
+            </w:tcMar>
+            <w:vAlign w:val="center"/>
+          </w:tcPr>
+          <w:p>
+            <w:pPr>
+              <w:spacing w:after="0" w:line="264" w:lineRule="auto"/>
+            </w:pPr>
+            <w:r>
+              <w:rPr>
+                <w:rFonts w:ascii="Calibri" w:hAnsi="Calibri" w:eastAsia="Calibri"/>
+                <w:sz w:val="20"/>
+              </w:rPr>
+              <w:t>Follows Apple Watch language</w:t>
+            </w:r>
+          </w:p>
+        </w:tc>
+        <w:tc>
+          <w:tcPr>
+            <w:tcW w:type="dxa" w:w="3120"/>
+            <w:tcMar>
+              <w:top w:w="80" w:type="dxa"/>
+              <w:start w:w="120" w:type="dxa"/>
+              <w:bottom w:w="80" w:type="dxa"/>
+              <w:end w:w="120" w:type="dxa"/>
+            </w:tcMar>
+            <w:vAlign w:val="center"/>
+          </w:tcPr>
+          <w:p>
+            <w:pPr>
+              <w:spacing w:after="0" w:line="264" w:lineRule="auto"/>
+            </w:pPr>
+            <w:r>
+              <w:rPr>
+                <w:rFonts w:ascii="Calibri" w:hAnsi="Calibri" w:eastAsia="Calibri"/>
+                <w:sz w:val="20"/>
+              </w:rPr>
+              <w:t>Watch settings detail text.</w:t>
+            </w:r>
+          </w:p>
+        </w:tc>
+      </w:tr>
+      <w:tr>
+        <w:tc>
+          <w:tcPr>
+            <w:tcW w:type="dxa" w:w="3120"/>
+            <w:tcMar>
+              <w:top w:w="80" w:type="dxa"/>
+              <w:start w:w="120" w:type="dxa"/>
+              <w:bottom w:w="80" w:type="dxa"/>
+              <w:end w:w="120" w:type="dxa"/>
+            </w:tcMar>
+            <w:vAlign w:val="center"/>
+          </w:tcPr>
+          <w:p>
+            <w:pPr>
+              <w:spacing w:after="0" w:line="264" w:lineRule="auto"/>
+            </w:pPr>
+            <w:r>
+              <w:rPr>
+                <w:rFonts w:ascii="Calibri" w:hAnsi="Calibri" w:eastAsia="Calibri"/>
+                <w:sz w:val="20"/>
+              </w:rPr>
+              <w:t>Segue la lingua di iPhone</w:t>
+            </w:r>
+          </w:p>
+        </w:tc>
+        <w:tc>
+          <w:tcPr>
+            <w:tcW w:type="dxa" w:w="3120"/>
+            <w:tcMar>
+              <w:top w:w="80" w:type="dxa"/>
+              <w:start w:w="120" w:type="dxa"/>
+              <w:bottom w:w="80" w:type="dxa"/>
+              <w:end w:w="120" w:type="dxa"/>
+            </w:tcMar>
+            <w:vAlign w:val="center"/>
+          </w:tcPr>
+          <w:p>
+            <w:pPr>
+              <w:spacing w:after="0" w:line="264" w:lineRule="auto"/>
+            </w:pPr>
+            <w:r>
+              <w:rPr>
+                <w:rFonts w:ascii="Calibri" w:hAnsi="Calibri" w:eastAsia="Calibri"/>
+                <w:sz w:val="20"/>
+              </w:rPr>
+              <w:t>Follows iPhone language</w:t>
+            </w:r>
+          </w:p>
+        </w:tc>
+        <w:tc>
+          <w:tcPr>
+            <w:tcW w:type="dxa" w:w="3120"/>
+            <w:tcMar>
+              <w:top w:w="80" w:type="dxa"/>
+              <w:start w:w="120" w:type="dxa"/>
+              <w:bottom w:w="80" w:type="dxa"/>
+              <w:end w:w="120" w:type="dxa"/>
+            </w:tcMar>
+            <w:vAlign w:val="center"/>
+          </w:tcPr>
+          <w:p>
+            <w:pPr>
+              <w:spacing w:after="0" w:line="264" w:lineRule="auto"/>
+            </w:pPr>
+            <w:r>
+              <w:rPr>
+                <w:rFonts w:ascii="Calibri" w:hAnsi="Calibri" w:eastAsia="Calibri"/>
+                <w:sz w:val="20"/>
+              </w:rPr>
+              <w:t>iOS Companion settings detail text.</w:t>
+            </w:r>
+          </w:p>
+        </w:tc>
+      </w:tr>
+      <w:tr>
+        <w:tc>
+          <w:tcPr>
+            <w:tcW w:type="dxa" w:w="3120"/>
+            <w:tcMar>
+              <w:top w:w="80" w:type="dxa"/>
+              <w:start w:w="120" w:type="dxa"/>
+              <w:bottom w:w="80" w:type="dxa"/>
+              <w:end w:w="120" w:type="dxa"/>
+            </w:tcMar>
+            <w:vAlign w:val="center"/>
+          </w:tcPr>
+          <w:p>
+            <w:pPr>
+              <w:spacing w:after="0" w:line="264" w:lineRule="auto"/>
+            </w:pPr>
+            <w:r>
+              <w:rPr>
+                <w:rFonts w:ascii="Calibri" w:hAnsi="Calibri" w:eastAsia="Calibri"/>
+                <w:sz w:val="20"/>
+              </w:rPr>
+              <w:t>Italiano</w:t>
+            </w:r>
+          </w:p>
+        </w:tc>
+        <w:tc>
+          <w:tcPr>
+            <w:tcW w:type="dxa" w:w="3120"/>
+            <w:tcMar>
+              <w:top w:w="80" w:type="dxa"/>
+              <w:start w:w="120" w:type="dxa"/>
+              <w:bottom w:w="80" w:type="dxa"/>
+              <w:end w:w="120" w:type="dxa"/>
+            </w:tcMar>
+            <w:vAlign w:val="center"/>
+          </w:tcPr>
+          <w:p>
+            <w:pPr>
+              <w:spacing w:after="0" w:line="264" w:lineRule="auto"/>
+            </w:pPr>
+            <w:r>
+              <w:rPr>
+                <w:rFonts w:ascii="Calibri" w:hAnsi="Calibri" w:eastAsia="Calibri"/>
+                <w:sz w:val="20"/>
+              </w:rPr>
+              <w:t>Italiano</w:t>
+            </w:r>
+          </w:p>
+        </w:tc>
+        <w:tc>
+          <w:tcPr>
+            <w:tcW w:type="dxa" w:w="3120"/>
+            <w:tcMar>
+              <w:top w:w="80" w:type="dxa"/>
+              <w:start w:w="120" w:type="dxa"/>
+              <w:bottom w:w="80" w:type="dxa"/>
+              <w:end w:w="120" w:type="dxa"/>
+            </w:tcMar>
+            <w:vAlign w:val="center"/>
+          </w:tcPr>
+          <w:p>
+            <w:pPr>
+              <w:spacing w:after="0" w:line="264" w:lineRule="auto"/>
+            </w:pPr>
+            <w:r>
+              <w:rPr>
+                <w:rFonts w:ascii="Calibri" w:hAnsi="Calibri" w:eastAsia="Calibri"/>
+                <w:sz w:val="20"/>
+              </w:rPr>
+              <w:t>Native language name.</w:t>
+            </w:r>
+          </w:p>
+        </w:tc>
+      </w:tr>
+      <w:tr>
+        <w:tc>
+          <w:tcPr>
+            <w:tcW w:type="dxa" w:w="3120"/>
+            <w:tcMar>
+              <w:top w:w="80" w:type="dxa"/>
+              <w:start w:w="120" w:type="dxa"/>
+              <w:bottom w:w="80" w:type="dxa"/>
+              <w:end w:w="120" w:type="dxa"/>
+            </w:tcMar>
+            <w:vAlign w:val="center"/>
+          </w:tcPr>
+          <w:p>
+            <w:pPr>
+              <w:spacing w:after="0" w:line="264" w:lineRule="auto"/>
+            </w:pPr>
+            <w:r>
+              <w:rPr>
+                <w:rFonts w:ascii="Calibri" w:hAnsi="Calibri" w:eastAsia="Calibri"/>
+                <w:sz w:val="20"/>
+              </w:rPr>
+              <w:t>Inglese</w:t>
+            </w:r>
+          </w:p>
+        </w:tc>
+        <w:tc>
+          <w:tcPr>
+            <w:tcW w:type="dxa" w:w="3120"/>
+            <w:tcMar>
+              <w:top w:w="80" w:type="dxa"/>
+              <w:start w:w="120" w:type="dxa"/>
+              <w:bottom w:w="80" w:type="dxa"/>
+              <w:end w:w="120" w:type="dxa"/>
+            </w:tcMar>
+            <w:vAlign w:val="center"/>
+          </w:tcPr>
+          <w:p>
+            <w:pPr>
+              <w:spacing w:after="0" w:line="264" w:lineRule="auto"/>
+            </w:pPr>
+            <w:r>
+              <w:rPr>
+                <w:rFonts w:ascii="Calibri" w:hAnsi="Calibri" w:eastAsia="Calibri"/>
+                <w:sz w:val="20"/>
+              </w:rPr>
+              <w:t>English</w:t>
+            </w:r>
+          </w:p>
+        </w:tc>
+        <w:tc>
+          <w:tcPr>
+            <w:tcW w:type="dxa" w:w="3120"/>
+            <w:tcMar>
+              <w:top w:w="80" w:type="dxa"/>
+              <w:start w:w="120" w:type="dxa"/>
+              <w:bottom w:w="80" w:type="dxa"/>
+              <w:end w:w="120" w:type="dxa"/>
+            </w:tcMar>
+            <w:vAlign w:val="center"/>
+          </w:tcPr>
+          <w:p>
+            <w:pPr>
+              <w:spacing w:after="0" w:line="264" w:lineRule="auto"/>
+            </w:pPr>
+            <w:r>
+              <w:rPr>
+                <w:rFonts w:ascii="Calibri" w:hAnsi="Calibri" w:eastAsia="Calibri"/>
+                <w:sz w:val="20"/>
+              </w:rPr>
+              <w:t>Native language name.</w:t>
+            </w:r>
+          </w:p>
+        </w:tc>
+      </w:tr>
+      <w:tr>
+        <w:tc>
+          <w:tcPr>
+            <w:tcW w:type="dxa" w:w="3120"/>
+            <w:tcMar>
+              <w:top w:w="80" w:type="dxa"/>
+              <w:start w:w="120" w:type="dxa"/>
+              <w:bottom w:w="80" w:type="dxa"/>
+              <w:end w:w="120" w:type="dxa"/>
+            </w:tcMar>
+            <w:vAlign w:val="center"/>
+          </w:tcPr>
+          <w:p>
+            <w:pPr>
+              <w:spacing w:after="0" w:line="264" w:lineRule="auto"/>
+            </w:pPr>
+            <w:r>
+              <w:rPr>
+                <w:rFonts w:ascii="Calibri" w:hAnsi="Calibri" w:eastAsia="Calibri"/>
+                <w:sz w:val="20"/>
+              </w:rPr>
+              <w:t>Lingua non supportata</w:t>
+            </w:r>
+          </w:p>
+        </w:tc>
+        <w:tc>
+          <w:tcPr>
+            <w:tcW w:type="dxa" w:w="3120"/>
+            <w:tcMar>
+              <w:top w:w="80" w:type="dxa"/>
+              <w:start w:w="120" w:type="dxa"/>
+              <w:bottom w:w="80" w:type="dxa"/>
+              <w:end w:w="120" w:type="dxa"/>
+            </w:tcMar>
+            <w:vAlign w:val="center"/>
+          </w:tcPr>
+          <w:p>
+            <w:pPr>
+              <w:spacing w:after="0" w:line="264" w:lineRule="auto"/>
+            </w:pPr>
+            <w:r>
+              <w:rPr>
+                <w:rFonts w:ascii="Calibri" w:hAnsi="Calibri" w:eastAsia="Calibri"/>
+                <w:sz w:val="20"/>
+              </w:rPr>
+              <w:t>Unsupported Language</w:t>
+            </w:r>
+          </w:p>
+        </w:tc>
+        <w:tc>
+          <w:tcPr>
+            <w:tcW w:type="dxa" w:w="3120"/>
+            <w:tcMar>
+              <w:top w:w="80" w:type="dxa"/>
+              <w:start w:w="120" w:type="dxa"/>
+              <w:bottom w:w="80" w:type="dxa"/>
+              <w:end w:w="120" w:type="dxa"/>
+            </w:tcMar>
+            <w:vAlign w:val="center"/>
+          </w:tcPr>
+          <w:p>
+            <w:pPr>
+              <w:spacing w:after="0" w:line="264" w:lineRule="auto"/>
+            </w:pPr>
+            <w:r>
+              <w:rPr>
+                <w:rFonts w:ascii="Calibri" w:hAnsi="Calibri" w:eastAsia="Calibri"/>
+                <w:sz w:val="20"/>
+              </w:rPr>
+              <w:t>Only needed for diagnostics or QA states.</w:t>
+            </w:r>
+          </w:p>
+        </w:tc>
+      </w:tr>
+      <w:tr>
+        <w:tc>
+          <w:tcPr>
+            <w:tcW w:type="dxa" w:w="3120"/>
+            <w:tcMar>
+              <w:top w:w="80" w:type="dxa"/>
+              <w:start w:w="120" w:type="dxa"/>
+              <w:bottom w:w="80" w:type="dxa"/>
+              <w:end w:w="120" w:type="dxa"/>
+            </w:tcMar>
+            <w:vAlign w:val="center"/>
+          </w:tcPr>
+          <w:p>
+            <w:pPr>
+              <w:spacing w:after="0" w:line="264" w:lineRule="auto"/>
+            </w:pPr>
+            <w:r>
+              <w:rPr>
+                <w:rFonts w:ascii="Calibri" w:hAnsi="Calibri" w:eastAsia="Calibri"/>
+                <w:sz w:val="20"/>
+              </w:rPr>
+              <w:t>Lingua non supportata. Uso italiano.</w:t>
+            </w:r>
+          </w:p>
+        </w:tc>
+        <w:tc>
+          <w:tcPr>
+            <w:tcW w:type="dxa" w:w="3120"/>
+            <w:tcMar>
+              <w:top w:w="80" w:type="dxa"/>
+              <w:start w:w="120" w:type="dxa"/>
+              <w:bottom w:w="80" w:type="dxa"/>
+              <w:end w:w="120" w:type="dxa"/>
+            </w:tcMar>
+            <w:vAlign w:val="center"/>
+          </w:tcPr>
+          <w:p>
+            <w:pPr>
+              <w:spacing w:after="0" w:line="264" w:lineRule="auto"/>
+            </w:pPr>
+            <w:r>
+              <w:rPr>
+                <w:rFonts w:ascii="Calibri" w:hAnsi="Calibri" w:eastAsia="Calibri"/>
+                <w:sz w:val="20"/>
+              </w:rPr>
+              <w:t>Unsupported language. Using Italian.</w:t>
+            </w:r>
+          </w:p>
+        </w:tc>
+        <w:tc>
+          <w:tcPr>
+            <w:tcW w:type="dxa" w:w="3120"/>
+            <w:tcMar>
+              <w:top w:w="80" w:type="dxa"/>
+              <w:start w:w="120" w:type="dxa"/>
+              <w:bottom w:w="80" w:type="dxa"/>
+              <w:end w:w="120" w:type="dxa"/>
+            </w:tcMar>
+            <w:vAlign w:val="center"/>
+          </w:tcPr>
+          <w:p>
+            <w:pPr>
+              <w:spacing w:after="0" w:line="264" w:lineRule="auto"/>
+            </w:pPr>
+            <w:r>
+              <w:rPr>
+                <w:rFonts w:ascii="Calibri" w:hAnsi="Calibri" w:eastAsia="Calibri"/>
+                <w:sz w:val="20"/>
+              </w:rPr>
+              <w:t>Fallback copy, if surfaced to the user.</w:t>
+            </w:r>
+          </w:p>
+        </w:tc>
+      </w:tr>
+      <w:tr>
+        <w:tc>
+          <w:tcPr>
+            <w:tcW w:type="dxa" w:w="3120"/>
+            <w:tcMar>
+              <w:top w:w="80" w:type="dxa"/>
+              <w:start w:w="120" w:type="dxa"/>
+              <w:bottom w:w="80" w:type="dxa"/>
+              <w:end w:w="120" w:type="dxa"/>
+            </w:tcMar>
+            <w:vAlign w:val="center"/>
+          </w:tcPr>
+          <w:p>
+            <w:pPr>
+              <w:spacing w:after="0" w:line="264" w:lineRule="auto"/>
+            </w:pPr>
+            <w:r>
+              <w:rPr>
+                <w:rFonts w:ascii="Calibri" w:hAnsi="Calibri" w:eastAsia="Calibri"/>
+                <w:sz w:val="20"/>
+              </w:rPr>
+              <w:t>La modifica della lingua non cambia unita, calcoli o dati salvati.</w:t>
+            </w:r>
+          </w:p>
+        </w:tc>
+        <w:tc>
+          <w:tcPr>
+            <w:tcW w:type="dxa" w:w="3120"/>
+            <w:tcMar>
+              <w:top w:w="80" w:type="dxa"/>
+              <w:start w:w="120" w:type="dxa"/>
+              <w:bottom w:w="80" w:type="dxa"/>
+              <w:end w:w="120" w:type="dxa"/>
+            </w:tcMar>
+            <w:vAlign w:val="center"/>
+          </w:tcPr>
+          <w:p>
+            <w:pPr>
+              <w:spacing w:after="0" w:line="264" w:lineRule="auto"/>
+            </w:pPr>
+            <w:r>
+              <w:rPr>
+                <w:rFonts w:ascii="Calibri" w:hAnsi="Calibri" w:eastAsia="Calibri"/>
+                <w:sz w:val="20"/>
+              </w:rPr>
+              <w:t>Changing language does not change units, calculations, or saved data.</w:t>
+            </w:r>
+          </w:p>
+        </w:tc>
+        <w:tc>
+          <w:tcPr>
+            <w:tcW w:type="dxa" w:w="3120"/>
+            <w:tcMar>
+              <w:top w:w="80" w:type="dxa"/>
+              <w:start w:w="120" w:type="dxa"/>
+              <w:bottom w:w="80" w:type="dxa"/>
+              <w:end w:w="120" w:type="dxa"/>
+            </w:tcMar>
+            <w:vAlign w:val="center"/>
+          </w:tcPr>
+          <w:p>
+            <w:pPr>
+              <w:spacing w:after="0" w:line="264" w:lineRule="auto"/>
+            </w:pPr>
+            <w:r>
+              <w:rPr>
+                <w:rFonts w:ascii="Calibri" w:hAnsi="Calibri" w:eastAsia="Calibri"/>
+                <w:sz w:val="20"/>
+              </w:rPr>
+              <w:t>Settings help text, if there is room on iOS.</w:t>
+            </w:r>
+          </w:p>
+        </w:tc>
+      </w:tr>
+    </w:tbl>
+    <w:p/>
+    <w:p>
+      <w:pPr>
+        <w:pStyle w:val="ListBullet"/>
+        <w:spacing w:after="80" w:line="276" w:lineRule="auto"/>
+      </w:pPr>
+      <w:r>
+        <w:rPr>
+          <w:rFonts w:ascii="Calibri" w:hAnsi="Calibri" w:eastAsia="Calibri"/>
+        </w:rPr>
+        <w:t>Prefer System Language over Automatic because it matches Apple platform language terminology more clearly.</w:t>
+      </w:r>
+    </w:p>
+    <w:p>
+      <w:pPr>
+        <w:pStyle w:val="ListBullet"/>
+        <w:spacing w:after="80" w:line="276" w:lineRule="auto"/>
+      </w:pPr>
+      <w:r>
+        <w:rPr>
+          <w:rFonts w:ascii="Calibri" w:hAnsi="Calibri" w:eastAsia="Calibri"/>
+        </w:rPr>
+        <w:t>Use native language names in the picker: Italiano, English, Francais, Deutsch, Espanol, etc.</w:t>
+      </w:r>
+    </w:p>
+    <w:p>
+      <w:pPr>
+        <w:pStyle w:val="ListBullet"/>
+        <w:spacing w:after="80" w:line="276" w:lineRule="auto"/>
+      </w:pPr>
+      <w:r>
+        <w:rPr>
+          <w:rFonts w:ascii="Calibri" w:hAnsi="Calibri" w:eastAsia="Calibri"/>
+        </w:rPr>
+        <w:t>Keep Watch explanatory text very short. If space is tight, show only System Language, Italiano, and English.</w:t>
+      </w:r>
+    </w:p>
+    <w:p>
+      <w:pPr>
+        <w:pStyle w:val="ListBullet"/>
+        <w:spacing w:after="80" w:line="276" w:lineRule="auto"/>
+      </w:pPr>
+      <w:r>
+        <w:rPr>
+          <w:rFonts w:ascii="Calibri" w:hAnsi="Calibri" w:eastAsia="Calibri"/>
+        </w:rPr>
+        <w:t>Do not translate unit symbols such as m, min, bar, C, m/min, PPO2, CNS%, OTU, MOD, SAC, TTR, or TTV.</w:t>
+      </w:r>
+    </w:p>
+    <w:p>
+      <w:pPr>
+        <w:pStyle w:val="Heading1"/>
+      </w:pPr>
+      <w:r>
+        <w:rPr>
+          <w:rFonts w:ascii="Calibri" w:hAnsi="Calibri" w:eastAsia="Calibri"/>
+          <w:b/>
+          <w:color w:val="007AFF"/>
+          <w:sz w:val="32"/>
+        </w:rPr>
+        <w:t>13. English Reference for Implementation Reviews</w:t>
+      </w:r>
+    </w:p>
+    <w:p>
+      <w:pPr>
+        <w:spacing w:after="80"/>
+      </w:pPr>
+      <w:r>
+        <w:rPr>
+          <w:rFonts w:ascii="Calibri" w:hAnsi="Calibri" w:eastAsia="Calibri"/>
+          <w:b/>
+          <w:color w:val="0B1F30"/>
+          <w:sz w:val="20"/>
+        </w:rPr>
+        <w:t>Implementation review reference</w:t>
+      </w:r>
+    </w:p>
+    <w:tbl>
+      <w:tblPr>
+        <w:tblStyle w:val="TableGrid"/>
+        <w:tblW w:type="dxa" w:w="9360"/>
+        <w:tblLayout w:type="fixed"/>
+        <w:tblLook w:firstColumn="1" w:firstRow="1" w:lastColumn="0" w:lastRow="0" w:noHBand="0" w:noVBand="1" w:val="04A0"/>
+      </w:tblPr>
+      <w:tblGrid>
+        <w:gridCol w:w="4680"/>
+        <w:gridCol w:w="4680"/>
+      </w:tblGrid>
+      <w:tr>
+        <w:trPr>
+          <w:tblHeader w:val="true"/>
+        </w:trPr>
+        <w:tc>
+          <w:tcPr>
+            <w:tcW w:type="dxa" w:w="3600"/>
+            <w:shd w:fill="D9EEF7"/>
+            <w:tcMar>
+              <w:top w:w="80" w:type="dxa"/>
+              <w:start w:w="120" w:type="dxa"/>
+              <w:bottom w:w="80" w:type="dxa"/>
+              <w:end w:w="120" w:type="dxa"/>
+            </w:tcMar>
+            <w:vAlign w:val="center"/>
+          </w:tcPr>
+          <w:p>
+            <w:pPr>
+              <w:spacing w:after="0"/>
+            </w:pPr>
+            <w:r>
+              <w:rPr>
+                <w:rFonts w:ascii="Calibri" w:hAnsi="Calibri" w:eastAsia="Calibri"/>
+                <w:b/>
+                <w:color w:val="0B1F30"/>
+                <w:sz w:val="20"/>
+              </w:rPr>
+              <w:t>Review item</w:t>
+            </w:r>
+          </w:p>
+        </w:tc>
+        <w:tc>
+          <w:tcPr>
+            <w:tcW w:type="dxa" w:w="5760"/>
+            <w:shd w:fill="D9EEF7"/>
+            <w:tcMar>
+              <w:top w:w="80" w:type="dxa"/>
+              <w:start w:w="120" w:type="dxa"/>
+              <w:bottom w:w="80" w:type="dxa"/>
+              <w:end w:w="120" w:type="dxa"/>
+            </w:tcMar>
+            <w:vAlign w:val="center"/>
+          </w:tcPr>
+          <w:p>
+            <w:pPr>
+              <w:spacing w:after="0"/>
+            </w:pPr>
+            <w:r>
+              <w:rPr>
+                <w:rFonts w:ascii="Calibri" w:hAnsi="Calibri" w:eastAsia="Calibri"/>
+                <w:b/>
+                <w:color w:val="0B1F30"/>
+                <w:sz w:val="20"/>
+              </w:rPr>
+              <w:t>Approved English wording</w:t>
+            </w:r>
+          </w:p>
+        </w:tc>
+      </w:tr>
+      <w:tr>
+        <w:tc>
+          <w:tcPr>
+            <w:tcW w:type="dxa" w:w="4680"/>
+            <w:tcMar>
+              <w:top w:w="80" w:type="dxa"/>
+              <w:start w:w="120" w:type="dxa"/>
+              <w:bottom w:w="80" w:type="dxa"/>
+              <w:end w:w="120" w:type="dxa"/>
+            </w:tcMar>
+            <w:vAlign w:val="center"/>
+          </w:tcPr>
+          <w:p>
+            <w:pPr>
+              <w:spacing w:after="0" w:line="264" w:lineRule="auto"/>
+            </w:pPr>
+            <w:r>
+              <w:rPr>
+                <w:rFonts w:ascii="Calibri" w:hAnsi="Calibri" w:eastAsia="Calibri"/>
+                <w:sz w:val="20"/>
+              </w:rPr>
+              <w:t>Default setting value</w:t>
+            </w:r>
+          </w:p>
+        </w:tc>
+        <w:tc>
+          <w:tcPr>
+            <w:tcW w:type="dxa" w:w="4680"/>
+            <w:tcMar>
+              <w:top w:w="80" w:type="dxa"/>
+              <w:start w:w="120" w:type="dxa"/>
+              <w:bottom w:w="80" w:type="dxa"/>
+              <w:end w:w="120" w:type="dxa"/>
+            </w:tcMar>
+            <w:vAlign w:val="center"/>
+          </w:tcPr>
+          <w:p>
+            <w:pPr>
+              <w:spacing w:after="0" w:line="264" w:lineRule="auto"/>
+            </w:pPr>
+            <w:r>
+              <w:rPr>
+                <w:rFonts w:ascii="Calibri" w:hAnsi="Calibri" w:eastAsia="Calibri"/>
+                <w:sz w:val="20"/>
+              </w:rPr>
+              <w:t>System Language</w:t>
+            </w:r>
+          </w:p>
+        </w:tc>
+      </w:tr>
+      <w:tr>
+        <w:tc>
+          <w:tcPr>
+            <w:tcW w:type="dxa" w:w="4680"/>
+            <w:tcMar>
+              <w:top w:w="80" w:type="dxa"/>
+              <w:start w:w="120" w:type="dxa"/>
+              <w:bottom w:w="80" w:type="dxa"/>
+              <w:end w:w="120" w:type="dxa"/>
+            </w:tcMar>
+            <w:vAlign w:val="center"/>
+          </w:tcPr>
+          <w:p>
+            <w:pPr>
+              <w:spacing w:after="0" w:line="264" w:lineRule="auto"/>
+            </w:pPr>
+            <w:r>
+              <w:rPr>
+                <w:rFonts w:ascii="Calibri" w:hAnsi="Calibri" w:eastAsia="Calibri"/>
+                <w:sz w:val="20"/>
+              </w:rPr>
+              <w:t>Manual Italian option</w:t>
+            </w:r>
+          </w:p>
+        </w:tc>
+        <w:tc>
+          <w:tcPr>
+            <w:tcW w:type="dxa" w:w="4680"/>
+            <w:tcMar>
+              <w:top w:w="80" w:type="dxa"/>
+              <w:start w:w="120" w:type="dxa"/>
+              <w:bottom w:w="80" w:type="dxa"/>
+              <w:end w:w="120" w:type="dxa"/>
+            </w:tcMar>
+            <w:vAlign w:val="center"/>
+          </w:tcPr>
+          <w:p>
+            <w:pPr>
+              <w:spacing w:after="0" w:line="264" w:lineRule="auto"/>
+            </w:pPr>
+            <w:r>
+              <w:rPr>
+                <w:rFonts w:ascii="Calibri" w:hAnsi="Calibri" w:eastAsia="Calibri"/>
+                <w:sz w:val="20"/>
+              </w:rPr>
+              <w:t>Italiano</w:t>
+            </w:r>
+          </w:p>
+        </w:tc>
+      </w:tr>
+      <w:tr>
+        <w:tc>
+          <w:tcPr>
+            <w:tcW w:type="dxa" w:w="4680"/>
+            <w:tcMar>
+              <w:top w:w="80" w:type="dxa"/>
+              <w:start w:w="120" w:type="dxa"/>
+              <w:bottom w:w="80" w:type="dxa"/>
+              <w:end w:w="120" w:type="dxa"/>
+            </w:tcMar>
+            <w:vAlign w:val="center"/>
+          </w:tcPr>
+          <w:p>
+            <w:pPr>
+              <w:spacing w:after="0" w:line="264" w:lineRule="auto"/>
+            </w:pPr>
+            <w:r>
+              <w:rPr>
+                <w:rFonts w:ascii="Calibri" w:hAnsi="Calibri" w:eastAsia="Calibri"/>
+                <w:sz w:val="20"/>
+              </w:rPr>
+              <w:t>Manual English option</w:t>
+            </w:r>
+          </w:p>
+        </w:tc>
+        <w:tc>
+          <w:tcPr>
+            <w:tcW w:type="dxa" w:w="4680"/>
+            <w:tcMar>
+              <w:top w:w="80" w:type="dxa"/>
+              <w:start w:w="120" w:type="dxa"/>
+              <w:bottom w:w="80" w:type="dxa"/>
+              <w:end w:w="120" w:type="dxa"/>
+            </w:tcMar>
+            <w:vAlign w:val="center"/>
+          </w:tcPr>
+          <w:p>
+            <w:pPr>
+              <w:spacing w:after="0" w:line="264" w:lineRule="auto"/>
+            </w:pPr>
+            <w:r>
+              <w:rPr>
+                <w:rFonts w:ascii="Calibri" w:hAnsi="Calibri" w:eastAsia="Calibri"/>
+                <w:sz w:val="20"/>
+              </w:rPr>
+              <w:t>English</w:t>
+            </w:r>
+          </w:p>
+        </w:tc>
+      </w:tr>
+      <w:tr>
+        <w:tc>
+          <w:tcPr>
+            <w:tcW w:type="dxa" w:w="4680"/>
+            <w:tcMar>
+              <w:top w:w="80" w:type="dxa"/>
+              <w:start w:w="120" w:type="dxa"/>
+              <w:bottom w:w="80" w:type="dxa"/>
+              <w:end w:w="120" w:type="dxa"/>
+            </w:tcMar>
+            <w:vAlign w:val="center"/>
+          </w:tcPr>
+          <w:p>
+            <w:pPr>
+              <w:spacing w:after="0" w:line="264" w:lineRule="auto"/>
+            </w:pPr>
+            <w:r>
+              <w:rPr>
+                <w:rFonts w:ascii="Calibri" w:hAnsi="Calibri" w:eastAsia="Calibri"/>
+                <w:sz w:val="20"/>
+              </w:rPr>
+              <w:t>Watch automatic detail</w:t>
+            </w:r>
+          </w:p>
+        </w:tc>
+        <w:tc>
+          <w:tcPr>
+            <w:tcW w:type="dxa" w:w="4680"/>
+            <w:tcMar>
+              <w:top w:w="80" w:type="dxa"/>
+              <w:start w:w="120" w:type="dxa"/>
+              <w:bottom w:w="80" w:type="dxa"/>
+              <w:end w:w="120" w:type="dxa"/>
+            </w:tcMar>
+            <w:vAlign w:val="center"/>
+          </w:tcPr>
+          <w:p>
+            <w:pPr>
+              <w:spacing w:after="0" w:line="264" w:lineRule="auto"/>
+            </w:pPr>
+            <w:r>
+              <w:rPr>
+                <w:rFonts w:ascii="Calibri" w:hAnsi="Calibri" w:eastAsia="Calibri"/>
+                <w:sz w:val="20"/>
+              </w:rPr>
+              <w:t>Follows Apple Watch language</w:t>
+            </w:r>
+          </w:p>
+        </w:tc>
+      </w:tr>
+      <w:tr>
+        <w:tc>
+          <w:tcPr>
+            <w:tcW w:type="dxa" w:w="4680"/>
+            <w:tcMar>
+              <w:top w:w="80" w:type="dxa"/>
+              <w:start w:w="120" w:type="dxa"/>
+              <w:bottom w:w="80" w:type="dxa"/>
+              <w:end w:w="120" w:type="dxa"/>
+            </w:tcMar>
+            <w:vAlign w:val="center"/>
+          </w:tcPr>
+          <w:p>
+            <w:pPr>
+              <w:spacing w:after="0" w:line="264" w:lineRule="auto"/>
+            </w:pPr>
+            <w:r>
+              <w:rPr>
+                <w:rFonts w:ascii="Calibri" w:hAnsi="Calibri" w:eastAsia="Calibri"/>
+                <w:sz w:val="20"/>
+              </w:rPr>
+              <w:t>iOS automatic detail</w:t>
+            </w:r>
+          </w:p>
+        </w:tc>
+        <w:tc>
+          <w:tcPr>
+            <w:tcW w:type="dxa" w:w="4680"/>
+            <w:tcMar>
+              <w:top w:w="80" w:type="dxa"/>
+              <w:start w:w="120" w:type="dxa"/>
+              <w:bottom w:w="80" w:type="dxa"/>
+              <w:end w:w="120" w:type="dxa"/>
+            </w:tcMar>
+            <w:vAlign w:val="center"/>
+          </w:tcPr>
+          <w:p>
+            <w:pPr>
+              <w:spacing w:after="0" w:line="264" w:lineRule="auto"/>
+            </w:pPr>
+            <w:r>
+              <w:rPr>
+                <w:rFonts w:ascii="Calibri" w:hAnsi="Calibri" w:eastAsia="Calibri"/>
+                <w:sz w:val="20"/>
+              </w:rPr>
+              <w:t>Follows iPhone language</w:t>
+            </w:r>
+          </w:p>
+        </w:tc>
+      </w:tr>
+      <w:tr>
+        <w:tc>
+          <w:tcPr>
+            <w:tcW w:type="dxa" w:w="4680"/>
+            <w:tcMar>
+              <w:top w:w="80" w:type="dxa"/>
+              <w:start w:w="120" w:type="dxa"/>
+              <w:bottom w:w="80" w:type="dxa"/>
+              <w:end w:w="120" w:type="dxa"/>
+            </w:tcMar>
+            <w:vAlign w:val="center"/>
+          </w:tcPr>
+          <w:p>
+            <w:pPr>
+              <w:spacing w:after="0" w:line="264" w:lineRule="auto"/>
+            </w:pPr>
+            <w:r>
+              <w:rPr>
+                <w:rFonts w:ascii="Calibri" w:hAnsi="Calibri" w:eastAsia="Calibri"/>
+                <w:sz w:val="20"/>
+              </w:rPr>
+              <w:t>Fallback note</w:t>
+            </w:r>
+          </w:p>
+        </w:tc>
+        <w:tc>
+          <w:tcPr>
+            <w:tcW w:type="dxa" w:w="4680"/>
+            <w:tcMar>
+              <w:top w:w="80" w:type="dxa"/>
+              <w:start w:w="120" w:type="dxa"/>
+              <w:bottom w:w="80" w:type="dxa"/>
+              <w:end w:w="120" w:type="dxa"/>
+            </w:tcMar>
+            <w:vAlign w:val="center"/>
+          </w:tcPr>
+          <w:p>
+            <w:pPr>
+              <w:spacing w:after="0" w:line="264" w:lineRule="auto"/>
+            </w:pPr>
+            <w:r>
+              <w:rPr>
+                <w:rFonts w:ascii="Calibri" w:hAnsi="Calibri" w:eastAsia="Calibri"/>
+                <w:sz w:val="20"/>
+              </w:rPr>
+              <w:t>Unsupported language. Using Italian.</w:t>
+            </w:r>
+          </w:p>
+        </w:tc>
+      </w:tr>
+      <w:tr>
+        <w:tc>
+          <w:tcPr>
+            <w:tcW w:type="dxa" w:w="4680"/>
+            <w:tcMar>
+              <w:top w:w="80" w:type="dxa"/>
+              <w:start w:w="120" w:type="dxa"/>
+              <w:bottom w:w="80" w:type="dxa"/>
+              <w:end w:w="120" w:type="dxa"/>
+            </w:tcMar>
+            <w:vAlign w:val="center"/>
+          </w:tcPr>
+          <w:p>
+            <w:pPr>
+              <w:spacing w:after="0" w:line="264" w:lineRule="auto"/>
+            </w:pPr>
+            <w:r>
+              <w:rPr>
+                <w:rFonts w:ascii="Calibri" w:hAnsi="Calibri" w:eastAsia="Calibri"/>
+                <w:sz w:val="20"/>
+              </w:rPr>
+              <w:t>Safety guard note</w:t>
+            </w:r>
+          </w:p>
+        </w:tc>
+        <w:tc>
+          <w:tcPr>
+            <w:tcW w:type="dxa" w:w="4680"/>
+            <w:tcMar>
+              <w:top w:w="80" w:type="dxa"/>
+              <w:start w:w="120" w:type="dxa"/>
+              <w:bottom w:w="80" w:type="dxa"/>
+              <w:end w:w="120" w:type="dxa"/>
+            </w:tcMar>
+            <w:vAlign w:val="center"/>
+          </w:tcPr>
+          <w:p>
+            <w:pPr>
+              <w:spacing w:after="0" w:line="264" w:lineRule="auto"/>
+            </w:pPr>
+            <w:r>
+              <w:rPr>
+                <w:rFonts w:ascii="Calibri" w:hAnsi="Calibri" w:eastAsia="Calibri"/>
+                <w:sz w:val="20"/>
+              </w:rPr>
+              <w:t>Changing language does not change units, calculations, or saved data.</w:t>
+            </w:r>
+          </w:p>
+        </w:tc>
+      </w:tr>
+    </w:tbl>
+    <w:p/>
     <w:sectPr>
       <w:footerReference w:type="default" r:id="rId9"/>
       <w:pgSz w:w="12240" w:h="15840"/>

</xml_diff>